<commit_message>
feat: top up t7 (Rights) and t8 (Consent) to 15+ exam-style sentence points
Addresses semantic review note that two topics fell just under the user's
'15 to 20 points' exam-answer target. Added honest sentences (MHCA/WHO rights
framing for t7; ICMR 2017 assent, APA Std 3.10(b), POCSO s.19 for t8) using
only verified-allowlist citations. Now 32 A4 pages; all QA still green.
</commit_message>
<xml_diff>
--- a/Psychotherapy_Unit_I_Comprehensive_Notes.docx
+++ b/Psychotherapy_Unit_I_Comprehensive_Notes.docx
@@ -4713,6 +4713,90 @@
       </w:r>
     </w:p>
     <w:p>
+      <w:pPr>
+        <w:pStyle w:val="ListBullet"/>
+      </w:pPr>
+      <w:r>
+        <w:t>The therapist has a right to fair remuneration under the agreed contract and to expect the client to respect the agreed time, fee and boundary arrangements of the work.</w:t>
+      </w:r>
+    </w:p>
+    <w:p>
+      <w:pPr>
+        <w:pStyle w:val="ListBullet"/>
+      </w:pPr>
+      <w:r>
+        <w:t>Rights and responsibilities are reciprocal, so each client right is mirrored by a therapist duty and each therapist right is matched by a client responsibility, keeping the relationship balanced.</w:t>
+      </w:r>
+    </w:p>
+    <w:p>
+      <w:pPr>
+        <w:pStyle w:val="ListBullet"/>
+      </w:pPr>
+      <w:r>
+        <w:t xml:space="preserve">Clarifying rights and duties in the first session operationalises the </w:t>
+      </w:r>
+      <w:r>
+        <w:t xml:space="preserve">informed consent </w:t>
+      </w:r>
+      <w:r>
+        <w:rPr>
+          <w:i/>
+        </w:rPr>
+        <w:t>(voluntary agreement after understanding adequate information)</w:t>
+      </w:r>
+      <w:r>
+        <w:t xml:space="preserve"> process and strengthens the </w:t>
+      </w:r>
+      <w:r>
+        <w:t xml:space="preserve">therapeutic alliance </w:t>
+      </w:r>
+      <w:r>
+        <w:rPr>
+          <w:i/>
+        </w:rPr>
+        <w:t>(the collaborative, trusting bond between client and therapist)</w:t>
+      </w:r>
+      <w:r>
+        <w:t>.</w:t>
+      </w:r>
+    </w:p>
+    <w:p>
+      <w:pPr>
+        <w:pStyle w:val="ListBullet"/>
+      </w:pPr>
+      <w:r>
+        <w:rPr>
+          <w:b/>
+        </w:rPr>
+        <w:t xml:space="preserve">Binding law: </w:t>
+      </w:r>
+      <w:r>
+        <w:t xml:space="preserve"> Many of these client rights are not merely ethical but statutory, because the Mental Healthcare Act 2017 gives legal force to information, confidentiality, access to records and complaint rights.</w:t>
+      </w:r>
+    </w:p>
+    <w:p>
+      <w:pPr>
+        <w:pStyle w:val="ListBullet"/>
+      </w:pPr>
+      <w:r>
+        <w:rPr>
+          <w:b/>
+        </w:rPr>
+        <w:t xml:space="preserve">Guideline: </w:t>
+      </w:r>
+      <w:r>
+        <w:t xml:space="preserve"> The rights-based framing reflects WHO guidance, which urges that mental-health care protect dignity, autonomy and participation rather than focus on control or symptom removal alone.</w:t>
+      </w:r>
+    </w:p>
+    <w:p>
+      <w:pPr>
+        <w:pStyle w:val="ListBullet"/>
+      </w:pPr>
+      <w:r>
+        <w:t>When rights and responsibilities are made explicit and revisited, boundary problems, missed-session disputes and premature drop-out all become markedly less likely over the course of therapy.</w:t>
+      </w:r>
+    </w:p>
+    <w:p>
       <w:r>
         <w:rPr>
           <w:b/>
@@ -5159,6 +5243,113 @@
       </w:r>
       <w:r>
         <w:t xml:space="preserve"> is sought alongside it.</w:t>
+      </w:r>
+    </w:p>
+    <w:p>
+      <w:pPr>
+        <w:pStyle w:val="ListBullet"/>
+      </w:pPr>
+      <w:r>
+        <w:t>Seeking assent respects the child as a developing person, so the therapist explains therapy in age-appropriate words, invites questions and gives genuine weight to a mature adolescent's views.</w:t>
+      </w:r>
+    </w:p>
+    <w:p>
+      <w:pPr>
+        <w:pStyle w:val="ListBullet"/>
+      </w:pPr>
+      <w:r>
+        <w:rPr>
+          <w:b/>
+        </w:rPr>
+        <w:t xml:space="preserve">Guideline: </w:t>
+      </w:r>
+      <w:r>
+        <w:t xml:space="preserve"> ICMR 2017 guidance generally expects assent from children of roughly seven to eighteen years, using simpler language for younger children and more weight for mature adolescents. </w:t>
+      </w:r>
+      <w:r>
+        <w:rPr>
+          <w:i/>
+          <w:color w:val="555555"/>
+        </w:rPr>
+        <w:t>[ICMR 2017]</w:t>
+      </w:r>
+    </w:p>
+    <w:p>
+      <w:pPr>
+        <w:pStyle w:val="ListBullet"/>
+      </w:pPr>
+      <w:r>
+        <w:t xml:space="preserve">A clear </w:t>
+      </w:r>
+      <w:r>
+        <w:t xml:space="preserve">confidentiality contract </w:t>
+      </w:r>
+      <w:r>
+        <w:rPr>
+          <w:i/>
+        </w:rPr>
+        <w:t>(an up-front agreement on what stays private and what parents are told)</w:t>
+      </w:r>
+      <w:r>
+        <w:t xml:space="preserve"> is agreed with the minor and guardian, naming the safety situations in which privacy is overridden.</w:t>
+      </w:r>
+    </w:p>
+    <w:p>
+      <w:pPr>
+        <w:pStyle w:val="ListBullet"/>
+      </w:pPr>
+      <w:r>
+        <w:t>When a guardian and a minor disagree, or the minor declines, the therapist explores the reasons without coercion, consults a supervisor, and considers the appropriate legal route before proceeding.</w:t>
+      </w:r>
+    </w:p>
+    <w:p>
+      <w:pPr>
+        <w:pStyle w:val="ListBullet"/>
+      </w:pPr>
+      <w:r>
+        <w:rPr>
+          <w:b/>
+        </w:rPr>
+        <w:t xml:space="preserve">Professional code: </w:t>
+      </w:r>
+      <w:r>
+        <w:t xml:space="preserve"> Where a person cannot give consent, APA Standard 3.10(b) still requires the therapist to give an appropriate explanation, seek assent, consider preferences and obtain substitute authorisation. </w:t>
+      </w:r>
+      <w:r>
+        <w:rPr>
+          <w:i/>
+          <w:color w:val="555555"/>
+        </w:rPr>
+        <w:t>[APA 2017, Std 3.10]</w:t>
+      </w:r>
+    </w:p>
+    <w:p>
+      <w:pPr>
+        <w:pStyle w:val="ListBullet"/>
+      </w:pPr>
+      <w:r>
+        <w:rPr>
+          <w:b/>
+        </w:rPr>
+        <w:t xml:space="preserve">Binding law: </w:t>
+      </w:r>
+      <w:r>
+        <w:t xml:space="preserve"> If a child discloses sexual abuse during therapy, the POCSO Act 2012 makes reporting mandatory, so the duty to report overrides the ordinary promise of confidentiality. </w:t>
+      </w:r>
+      <w:r>
+        <w:rPr>
+          <w:i/>
+          <w:color w:val="555555"/>
+        </w:rPr>
+        <w:t>[POCSO 2012, s.19]</w:t>
+      </w:r>
+    </w:p>
+    <w:p>
+      <w:pPr>
+        <w:pStyle w:val="ListBullet"/>
+      </w:pPr>
+      <w:r>
+        <w:t>Consent for clients with impaired capacity, such as severe psychosis or intellectual disability, follows the same logic, combining substitute decision-making with the person's own assent wherever possible.</w:t>
       </w:r>
     </w:p>
     <w:p>

</xml_diff>